<commit_message>
Correct domain numbering to official blueprint; add last-minute cheatsheet
Domain order now matches the published CCAR-F v1.0 blueprint:
  D1 Agentic (27%), D2 Tool Design & MCP (18%), D3 Claude Code (20%),
  D4 Prompt Engineering (20%), D5 Context Management (15%)

Previously numbered by descending weight, which mislabelled D2/D3/D4 and
would misdirect study after a real score report.

- index.html: DOMAINS/WEIGHT constants and 39 question domain tags remapped
- tools/make_guide.js: sections reordered and relabelled; output path now
  writes to docs/ regardless of cwd
- docs/CCA-F_Study_Guide.docx regenerated
- CHEATSHEET.md: new one-page-per-domain cram sheet
</commit_message>
<xml_diff>
--- a/docs/CCA-F_Study_Guide.docx
+++ b/docs/CCA-F_Study_Guide.docx
@@ -987,7 +987,7 @@
                 <w:sz w:val="20"/>
                 <w:szCs w:val="20"/>
               </w:rPr>
-              <w:t xml:space="preserve">Claude Code Configuration &amp; Workflows</w:t>
+              <w:t xml:space="preserve">Tool Design &amp; MCP Integration</w:t>
             </w:r>
           </w:p>
         </w:tc>
@@ -1010,7 +1010,7 @@
                 <w:sz w:val="20"/>
                 <w:szCs w:val="20"/>
               </w:rPr>
-              <w:t xml:space="preserve">20%</w:t>
+              <w:t xml:space="preserve">18%</w:t>
             </w:r>
           </w:p>
         </w:tc>
@@ -1033,7 +1033,7 @@
                 <w:sz w:val="20"/>
                 <w:szCs w:val="20"/>
               </w:rPr>
-              <w:t xml:space="preserve">12</w:t>
+              <w:t xml:space="preserve">11</w:t>
             </w:r>
           </w:p>
         </w:tc>
@@ -1079,7 +1079,7 @@
                 <w:sz w:val="20"/>
                 <w:szCs w:val="20"/>
               </w:rPr>
-              <w:t xml:space="preserve">Prompt Engineering &amp; Structured Output</w:t>
+              <w:t xml:space="preserve">Claude Code Configuration &amp; Workflows</w:t>
             </w:r>
           </w:p>
         </w:tc>
@@ -1171,7 +1171,7 @@
                 <w:sz w:val="20"/>
                 <w:szCs w:val="20"/>
               </w:rPr>
-              <w:t xml:space="preserve">Tool Design &amp; MCP Integration</w:t>
+              <w:t xml:space="preserve">Prompt Engineering &amp; Structured Output</w:t>
             </w:r>
           </w:p>
         </w:tc>
@@ -1194,7 +1194,7 @@
                 <w:sz w:val="20"/>
                 <w:szCs w:val="20"/>
               </w:rPr>
-              <w:t xml:space="preserve">18%</w:t>
+              <w:t xml:space="preserve">20%</w:t>
             </w:r>
           </w:p>
         </w:tc>
@@ -1217,7 +1217,7 @@
                 <w:sz w:val="20"/>
                 <w:szCs w:val="20"/>
               </w:rPr>
-              <w:t xml:space="preserve">11</w:t>
+              <w:t xml:space="preserve">12</w:t>
             </w:r>
           </w:p>
         </w:tc>
@@ -1756,7 +1756,7 @@
         <w:rPr>
           <w:color w:val="C15F3C"/>
         </w:rPr>
-        <w:t xml:space="preserve">3. Domain 2 — Claude Code Configuration &amp; Workflows (20%)</w:t>
+        <w:t xml:space="preserve">3. Domain 2 — Tool Design &amp; MCP Integration (18%)</w:t>
       </w:r>
     </w:p>
     <w:p>
@@ -1765,45 +1765,75 @@
         <w:spacing w:after="120" w:before="280"/>
       </w:pPr>
       <w:r>
-        <w:t xml:space="preserve">CLAUDE.md hierarchy</w:t>
-      </w:r>
-    </w:p>
-    <w:p>
-      <w:pPr>
-        <w:spacing w:after="120"/>
-      </w:pPr>
-      <w:r>
-        <w:t xml:space="preserve">Memory files load in order, more specific overriding/adding to more general:</w:t>
-      </w:r>
-    </w:p>
-    <w:p>
-      <w:pPr>
-        <w:pStyle w:val="ListParagraph"/>
-        <w:numPr>
-          <w:ilvl w:val="0"/>
-          <w:numId w:val="2"/>
-        </w:numPr>
-        <w:spacing w:after="80"/>
-      </w:pPr>
-      <w:r>
-        <w:rPr>
-          <w:b/>
-          <w:bCs/>
-        </w:rPr>
-        <w:t xml:space="preserve">Enterprise policy</w:t>
-      </w:r>
-      <w:r>
-        <w:t xml:space="preserve"> (managed, org-wide) → </w:t>
-      </w:r>
-      <w:r>
-        <w:rPr>
-          <w:b/>
-          <w:bCs/>
-        </w:rPr>
-        <w:t xml:space="preserve">user level</w:t>
-      </w:r>
-      <w:r>
-        <w:t xml:space="preserve"> (</w:t>
+        <w:t xml:space="preserve">Writing tools Claude can use correctly</w:t>
+      </w:r>
+    </w:p>
+    <w:p>
+      <w:pPr>
+        <w:pStyle w:val="ListParagraph"/>
+        <w:numPr>
+          <w:ilvl w:val="0"/>
+          <w:numId w:val="2"/>
+        </w:numPr>
+        <w:spacing w:after="80"/>
+      </w:pPr>
+      <w:r>
+        <w:rPr>
+          <w:b/>
+          <w:bCs/>
+        </w:rPr>
+        <w:t xml:space="preserve">Descriptions are prompts.</w:t>
+      </w:r>
+      <w:r>
+        <w:t xml:space="preserve"> Say what the tool does, when to use it, and when NOT to — especially for similar-sounding tools. Most tool-selection bugs are description bugs, not model bugs.</w:t>
+      </w:r>
+    </w:p>
+    <w:p>
+      <w:pPr>
+        <w:pStyle w:val="ListParagraph"/>
+        <w:numPr>
+          <w:ilvl w:val="0"/>
+          <w:numId w:val="2"/>
+        </w:numPr>
+        <w:spacing w:after="80"/>
+      </w:pPr>
+      <w:r>
+        <w:t xml:space="preserve">Avoid overlapping tools; merge or sharply differentiate them. Fewer, well-named, well-scoped tools beat many ambiguous ones. Distribute tools across agents so each agent sees only what its role needs.</w:t>
+      </w:r>
+    </w:p>
+    <w:p>
+      <w:pPr>
+        <w:pStyle w:val="ListParagraph"/>
+        <w:numPr>
+          <w:ilvl w:val="0"/>
+          <w:numId w:val="2"/>
+        </w:numPr>
+        <w:spacing w:after="80"/>
+      </w:pPr>
+      <w:r>
+        <w:t xml:space="preserve">Input schemas: descriptive parameter names, enums for closed sets, required vs. optional made deliberate. Return concise, high-signal results — huge payloads burn context.</w:t>
+      </w:r>
+    </w:p>
+    <w:p>
+      <w:pPr>
+        <w:pStyle w:val="Heading2"/>
+        <w:spacing w:after="120" w:before="280"/>
+      </w:pPr>
+      <w:r>
+        <w:t xml:space="preserve">Structured error responses</w:t>
+      </w:r>
+    </w:p>
+    <w:p>
+      <w:pPr>
+        <w:pStyle w:val="ListParagraph"/>
+        <w:numPr>
+          <w:ilvl w:val="0"/>
+          <w:numId w:val="2"/>
+        </w:numPr>
+        <w:spacing w:after="80"/>
+      </w:pPr>
+      <w:r>
+        <w:t xml:space="preserve">Return errors to the model as data it can act on: an </w:t>
       </w:r>
       <w:r>
         <w:rPr>
@@ -1812,20 +1842,10 @@
           <w:sz w:val="20"/>
           <w:szCs w:val="20"/>
         </w:rPr>
-        <w:t xml:space="preserve">~/.claude/CLAUDE.md</w:t>
-      </w:r>
-      <w:r>
-        <w:t xml:space="preserve">, personal, all projects) → </w:t>
-      </w:r>
-      <w:r>
-        <w:rPr>
-          <w:b/>
-          <w:bCs/>
-        </w:rPr>
-        <w:t xml:space="preserve">project root</w:t>
-      </w:r>
-      <w:r>
-        <w:t xml:space="preserve"> (</w:t>
+        <w:t xml:space="preserve">errorCategory</w:t>
+      </w:r>
+      <w:r>
+        <w:t xml:space="preserve"> (e.g. validation, not_found, rate_limit), an </w:t>
       </w:r>
       <w:r>
         <w:rPr>
@@ -1834,33 +1854,151 @@
           <w:sz w:val="20"/>
           <w:szCs w:val="20"/>
         </w:rPr>
-        <w:t xml:space="preserve">CLAUDE.md</w:t>
-      </w:r>
-      <w:r>
-        <w:t xml:space="preserve">, checked in, shared with the team) → </w:t>
-      </w:r>
-      <w:r>
-        <w:rPr>
-          <w:b/>
-          <w:bCs/>
-        </w:rPr>
-        <w:t xml:space="preserve">subdirectory CLAUDE.md</w:t>
-      </w:r>
-      <w:r>
-        <w:t xml:space="preserve"> (loaded when working in that subtree).</w:t>
-      </w:r>
-    </w:p>
-    <w:p>
-      <w:pPr>
-        <w:pStyle w:val="ListParagraph"/>
-        <w:numPr>
-          <w:ilvl w:val="0"/>
-          <w:numId w:val="2"/>
-        </w:numPr>
-        <w:spacing w:after="80"/>
-      </w:pPr>
-      <w:r>
-        <w:t xml:space="preserve">Team conventions belong in the project CLAUDE.md (committed); personal preferences belong at user level. </w:t>
+        <w:t xml:space="preserve">isRetryable</w:t>
+      </w:r>
+      <w:r>
+        <w:t xml:space="preserve"> flag, and a human-readable message suggesting the fix. This lets the agent decide: retry, change inputs, try another tool, or escalate. Raising an unstructured exception (or hiding the failure) strands the loop.</w:t>
+      </w:r>
+    </w:p>
+    <w:p>
+      <w:pPr>
+        <w:pStyle w:val="Heading2"/>
+        <w:spacing w:after="120" w:before="280"/>
+      </w:pPr>
+      <w:r>
+        <w:t xml:space="preserve">MCP essentials</w:t>
+      </w:r>
+    </w:p>
+    <w:p>
+      <w:pPr>
+        <w:pStyle w:val="ListParagraph"/>
+        <w:numPr>
+          <w:ilvl w:val="0"/>
+          <w:numId w:val="2"/>
+        </w:numPr>
+        <w:spacing w:after="80"/>
+      </w:pPr>
+      <w:r>
+        <w:rPr>
+          <w:b/>
+          <w:bCs/>
+        </w:rPr>
+        <w:t xml:space="preserve">Primitives: tools</w:t>
+      </w:r>
+      <w:r>
+        <w:t xml:space="preserve"> (model-invoked actions), </w:t>
+      </w:r>
+      <w:r>
+        <w:rPr>
+          <w:b/>
+          <w:bCs/>
+        </w:rPr>
+        <w:t xml:space="preserve">resources</w:t>
+      </w:r>
+      <w:r>
+        <w:t xml:space="preserve"> (application-controlled data/context), </w:t>
+      </w:r>
+      <w:r>
+        <w:rPr>
+          <w:b/>
+          <w:bCs/>
+        </w:rPr>
+        <w:t xml:space="preserve">prompts</w:t>
+      </w:r>
+      <w:r>
+        <w:t xml:space="preserve"> (user-invoked templates). Know which is which — 'expose read-only reference data' → resource, 'let the model act' → tool.</w:t>
+      </w:r>
+    </w:p>
+    <w:p>
+      <w:pPr>
+        <w:pStyle w:val="ListParagraph"/>
+        <w:numPr>
+          <w:ilvl w:val="0"/>
+          <w:numId w:val="2"/>
+        </w:numPr>
+        <w:spacing w:after="80"/>
+      </w:pPr>
+      <w:r>
+        <w:rPr>
+          <w:b/>
+          <w:bCs/>
+        </w:rPr>
+        <w:t xml:space="preserve">Transports:</w:t>
+      </w:r>
+      <w:r>
+        <w:t xml:space="preserve"> stdio for local/same-machine servers; streamable HTTP for remote/shared servers. Remote servers typically add OAuth-based auth.</w:t>
+      </w:r>
+    </w:p>
+    <w:p>
+      <w:pPr>
+        <w:pStyle w:val="ListParagraph"/>
+        <w:numPr>
+          <w:ilvl w:val="0"/>
+          <w:numId w:val="2"/>
+        </w:numPr>
+        <w:spacing w:after="80"/>
+      </w:pPr>
+      <w:r>
+        <w:t xml:space="preserve">Advanced topics that appear: sampling (server asks the client's model for a completion), notifications (server-initiated updates), and keeping servers stateless for scale.</w:t>
+      </w:r>
+    </w:p>
+    <w:p>
+      <w:pPr>
+        <w:pStyle w:val="Heading1"/>
+        <w:spacing w:after="160" w:before="360"/>
+      </w:pPr>
+      <w:r>
+        <w:rPr>
+          <w:color w:val="C15F3C"/>
+        </w:rPr>
+        <w:t xml:space="preserve">4. Domain 3 — Claude Code Configuration &amp; Workflows (20%)</w:t>
+      </w:r>
+    </w:p>
+    <w:p>
+      <w:pPr>
+        <w:pStyle w:val="Heading2"/>
+        <w:spacing w:after="120" w:before="280"/>
+      </w:pPr>
+      <w:r>
+        <w:t xml:space="preserve">CLAUDE.md hierarchy</w:t>
+      </w:r>
+    </w:p>
+    <w:p>
+      <w:pPr>
+        <w:spacing w:after="120"/>
+      </w:pPr>
+      <w:r>
+        <w:t xml:space="preserve">Memory files load in order, more specific overriding/adding to more general:</w:t>
+      </w:r>
+    </w:p>
+    <w:p>
+      <w:pPr>
+        <w:pStyle w:val="ListParagraph"/>
+        <w:numPr>
+          <w:ilvl w:val="0"/>
+          <w:numId w:val="2"/>
+        </w:numPr>
+        <w:spacing w:after="80"/>
+      </w:pPr>
+      <w:r>
+        <w:rPr>
+          <w:b/>
+          <w:bCs/>
+        </w:rPr>
+        <w:t xml:space="preserve">Enterprise policy</w:t>
+      </w:r>
+      <w:r>
+        <w:t xml:space="preserve"> (managed, org-wide) → </w:t>
+      </w:r>
+      <w:r>
+        <w:rPr>
+          <w:b/>
+          <w:bCs/>
+        </w:rPr>
+        <w:t xml:space="preserve">user level</w:t>
+      </w:r>
+      <w:r>
+        <w:t xml:space="preserve"> (</w:t>
       </w:r>
       <w:r>
         <w:rPr>
@@ -1869,21 +2007,21 @@
           <w:sz w:val="20"/>
           <w:szCs w:val="20"/>
         </w:rPr>
-        <w:t xml:space="preserve">CLAUDE.local.md</w:t>
-      </w:r>
-      <w:r>
-        <w:t xml:space="preserve"> / not-committed variants hold machine-local settings.</w:t>
-      </w:r>
-    </w:p>
-    <w:p>
-      <w:pPr>
-        <w:pStyle w:val="ListParagraph"/>
-        <w:numPr>
-          <w:ilvl w:val="0"/>
-          <w:numId w:val="2"/>
-        </w:numPr>
-        <w:spacing w:after="80"/>
-      </w:pPr>
+        <w:t xml:space="preserve">~/.claude/CLAUDE.md</w:t>
+      </w:r>
+      <w:r>
+        <w:t xml:space="preserve">, personal, all projects) → </w:t>
+      </w:r>
+      <w:r>
+        <w:rPr>
+          <w:b/>
+          <w:bCs/>
+        </w:rPr>
+        <w:t xml:space="preserve">project root</w:t>
+      </w:r>
+      <w:r>
+        <w:t xml:space="preserve"> (</w:t>
+      </w:r>
       <w:r>
         <w:rPr>
           <w:rFonts w:ascii="Consolas" w:cs="Consolas" w:eastAsia="Consolas" w:hAnsi="Consolas"/>
@@ -1891,32 +2029,33 @@
           <w:sz w:val="20"/>
           <w:szCs w:val="20"/>
         </w:rPr>
-        <w:t xml:space="preserve">.claude/rules/</w:t>
-      </w:r>
-      <w:r>
-        <w:t xml:space="preserve"> holds modular rule files; YAML frontmatter with path globs scopes a rule to matching files only — the exam likes 'apply this rule only to frontend code' setups.</w:t>
-      </w:r>
-    </w:p>
-    <w:p>
-      <w:pPr>
-        <w:pStyle w:val="Heading2"/>
-        <w:spacing w:after="120" w:before="280"/>
-      </w:pPr>
-      <w:r>
-        <w:t xml:space="preserve">Slash commands and skills</w:t>
-      </w:r>
-    </w:p>
-    <w:p>
-      <w:pPr>
-        <w:pStyle w:val="ListParagraph"/>
-        <w:numPr>
-          <w:ilvl w:val="0"/>
-          <w:numId w:val="2"/>
-        </w:numPr>
-        <w:spacing w:after="80"/>
-      </w:pPr>
-      <w:r>
-        <w:t xml:space="preserve">Custom slash commands are Markdown prompt templates in </w:t>
+        <w:t xml:space="preserve">CLAUDE.md</w:t>
+      </w:r>
+      <w:r>
+        <w:t xml:space="preserve">, checked in, shared with the team) → </w:t>
+      </w:r>
+      <w:r>
+        <w:rPr>
+          <w:b/>
+          <w:bCs/>
+        </w:rPr>
+        <w:t xml:space="preserve">subdirectory CLAUDE.md</w:t>
+      </w:r>
+      <w:r>
+        <w:t xml:space="preserve"> (loaded when working in that subtree).</w:t>
+      </w:r>
+    </w:p>
+    <w:p>
+      <w:pPr>
+        <w:pStyle w:val="ListParagraph"/>
+        <w:numPr>
+          <w:ilvl w:val="0"/>
+          <w:numId w:val="2"/>
+        </w:numPr>
+        <w:spacing w:after="80"/>
+      </w:pPr>
+      <w:r>
+        <w:t xml:space="preserve">Team conventions belong in the project CLAUDE.md (committed); personal preferences belong at user level. </w:t>
       </w:r>
       <w:r>
         <w:rPr>
@@ -1925,11 +2064,21 @@
           <w:sz w:val="20"/>
           <w:szCs w:val="20"/>
         </w:rPr>
-        <w:t xml:space="preserve">.claude/commands/</w:t>
-      </w:r>
-      <w:r>
-        <w:t xml:space="preserve"> (project) or </w:t>
-      </w:r>
+        <w:t xml:space="preserve">CLAUDE.local.md</w:t>
+      </w:r>
+      <w:r>
+        <w:t xml:space="preserve"> / not-committed variants hold machine-local settings.</w:t>
+      </w:r>
+    </w:p>
+    <w:p>
+      <w:pPr>
+        <w:pStyle w:val="ListParagraph"/>
+        <w:numPr>
+          <w:ilvl w:val="0"/>
+          <w:numId w:val="2"/>
+        </w:numPr>
+        <w:spacing w:after="80"/>
+      </w:pPr>
       <w:r>
         <w:rPr>
           <w:rFonts w:ascii="Consolas" w:cs="Consolas" w:eastAsia="Consolas" w:hAnsi="Consolas"/>
@@ -1937,10 +2086,32 @@
           <w:sz w:val="20"/>
           <w:szCs w:val="20"/>
         </w:rPr>
-        <w:t xml:space="preserve">~/.claude/commands/</w:t>
-      </w:r>
-      <w:r>
-        <w:t xml:space="preserve"> (personal); </w:t>
+        <w:t xml:space="preserve">.claude/rules/</w:t>
+      </w:r>
+      <w:r>
+        <w:t xml:space="preserve"> holds modular rule files; YAML frontmatter with path globs scopes a rule to matching files only — the exam likes 'apply this rule only to frontend code' setups.</w:t>
+      </w:r>
+    </w:p>
+    <w:p>
+      <w:pPr>
+        <w:pStyle w:val="Heading2"/>
+        <w:spacing w:after="120" w:before="280"/>
+      </w:pPr>
+      <w:r>
+        <w:t xml:space="preserve">Slash commands and skills</w:t>
+      </w:r>
+    </w:p>
+    <w:p>
+      <w:pPr>
+        <w:pStyle w:val="ListParagraph"/>
+        <w:numPr>
+          <w:ilvl w:val="0"/>
+          <w:numId w:val="2"/>
+        </w:numPr>
+        <w:spacing w:after="80"/>
+      </w:pPr>
+      <w:r>
+        <w:t xml:space="preserve">Custom slash commands are Markdown prompt templates in </w:t>
       </w:r>
       <w:r>
         <w:rPr>
@@ -1949,23 +2120,10 @@
           <w:sz w:val="20"/>
           <w:szCs w:val="20"/>
         </w:rPr>
-        <w:t xml:space="preserve">$ARGUMENTS</w:t>
-      </w:r>
-      <w:r>
-        <w:t xml:space="preserve"> injects what the user typed.</w:t>
-      </w:r>
-    </w:p>
-    <w:p>
-      <w:pPr>
-        <w:pStyle w:val="ListParagraph"/>
-        <w:numPr>
-          <w:ilvl w:val="0"/>
-          <w:numId w:val="2"/>
-        </w:numPr>
-        <w:spacing w:after="80"/>
-      </w:pPr>
-      <w:r>
-        <w:t xml:space="preserve">Skills are directories with a </w:t>
+        <w:t xml:space="preserve">.claude/commands/</w:t>
+      </w:r>
+      <w:r>
+        <w:t xml:space="preserve"> (project) or </w:t>
       </w:r>
       <w:r>
         <w:rPr>
@@ -1974,10 +2132,10 @@
           <w:sz w:val="20"/>
           <w:szCs w:val="20"/>
         </w:rPr>
-        <w:t xml:space="preserve">SKILL.md</w:t>
-      </w:r>
-      <w:r>
-        <w:t xml:space="preserve"> whose frontmatter has </w:t>
+        <w:t xml:space="preserve">~/.claude/commands/</w:t>
+      </w:r>
+      <w:r>
+        <w:t xml:space="preserve"> (personal); </w:t>
       </w:r>
       <w:r>
         <w:rPr>
@@ -1986,10 +2144,23 @@
           <w:sz w:val="20"/>
           <w:szCs w:val="20"/>
         </w:rPr>
-        <w:t xml:space="preserve">name</w:t>
-      </w:r>
-      <w:r>
-        <w:t xml:space="preserve"> and </w:t>
+        <w:t xml:space="preserve">$ARGUMENTS</w:t>
+      </w:r>
+      <w:r>
+        <w:t xml:space="preserve"> injects what the user typed.</w:t>
+      </w:r>
+    </w:p>
+    <w:p>
+      <w:pPr>
+        <w:pStyle w:val="ListParagraph"/>
+        <w:numPr>
+          <w:ilvl w:val="0"/>
+          <w:numId w:val="2"/>
+        </w:numPr>
+        <w:spacing w:after="80"/>
+      </w:pPr>
+      <w:r>
+        <w:t xml:space="preserve">Skills are directories with a </w:t>
       </w:r>
       <w:r>
         <w:rPr>
@@ -1998,10 +2169,10 @@
           <w:sz w:val="20"/>
           <w:szCs w:val="20"/>
         </w:rPr>
-        <w:t xml:space="preserve">description</w:t>
-      </w:r>
-      <w:r>
-        <w:t xml:space="preserve"> (the description drives automatic triggering — write it for the model). </w:t>
+        <w:t xml:space="preserve">SKILL.md</w:t>
+      </w:r>
+      <w:r>
+        <w:t xml:space="preserve"> whose frontmatter has </w:t>
       </w:r>
       <w:r>
         <w:rPr>
@@ -2010,10 +2181,10 @@
           <w:sz w:val="20"/>
           <w:szCs w:val="20"/>
         </w:rPr>
-        <w:t xml:space="preserve">allowed-tools</w:t>
-      </w:r>
-      <w:r>
-        <w:t xml:space="preserve"> restricts what a skill may use; </w:t>
+        <w:t xml:space="preserve">name</w:t>
+      </w:r>
+      <w:r>
+        <w:t xml:space="preserve"> and </w:t>
       </w:r>
       <w:r>
         <w:rPr>
@@ -2022,52 +2193,11 @@
           <w:sz w:val="20"/>
           <w:szCs w:val="20"/>
         </w:rPr>
-        <w:t xml:space="preserve">context: fork</w:t>
-      </w:r>
-      <w:r>
-        <w:t xml:space="preserve"> runs it in a subagent so its work doesn't consume the main context.</w:t>
-      </w:r>
-    </w:p>
-    <w:p>
-      <w:pPr>
-        <w:pStyle w:val="Heading2"/>
-        <w:spacing w:after="120" w:before="280"/>
-      </w:pPr>
-      <w:r>
-        <w:t xml:space="preserve">Plan mode vs. direct execution</w:t>
-      </w:r>
-    </w:p>
-    <w:p>
-      <w:pPr>
-        <w:pStyle w:val="ListParagraph"/>
-        <w:numPr>
-          <w:ilvl w:val="0"/>
-          <w:numId w:val="2"/>
-        </w:numPr>
-        <w:spacing w:after="80"/>
-      </w:pPr>
-      <w:r>
-        <w:t xml:space="preserve">Plan mode makes Claude research and propose an approach before editing anything. Choose it for multi-file refactors, unfamiliar codebases, or risky changes needing review. Direct execution is right for small, well-understood edits — planning everything wastes time and tokens.</w:t>
-      </w:r>
-    </w:p>
-    <w:p>
-      <w:pPr>
-        <w:pStyle w:val="Heading2"/>
-        <w:spacing w:after="120" w:before="280"/>
-      </w:pPr>
-      <w:r>
-        <w:t xml:space="preserve">Headless mode and CI/CD</w:t>
-      </w:r>
-    </w:p>
-    <w:p>
-      <w:pPr>
-        <w:pStyle w:val="ListParagraph"/>
-        <w:numPr>
-          <w:ilvl w:val="0"/>
-          <w:numId w:val="2"/>
-        </w:numPr>
-        <w:spacing w:after="80"/>
-      </w:pPr>
+        <w:t xml:space="preserve">description</w:t>
+      </w:r>
+      <w:r>
+        <w:t xml:space="preserve"> (the description drives automatic triggering — write it for the model). </w:t>
+      </w:r>
       <w:r>
         <w:rPr>
           <w:rFonts w:ascii="Consolas" w:cs="Consolas" w:eastAsia="Consolas" w:hAnsi="Consolas"/>
@@ -2075,10 +2205,10 @@
           <w:sz w:val="20"/>
           <w:szCs w:val="20"/>
         </w:rPr>
-        <w:t xml:space="preserve">claude -p "prompt"</w:t>
-      </w:r>
-      <w:r>
-        <w:t xml:space="preserve"> runs non-interactively (print mode) for pipelines; </w:t>
+        <w:t xml:space="preserve">allowed-tools</w:t>
+      </w:r>
+      <w:r>
+        <w:t xml:space="preserve"> restricts what a skill may use; </w:t>
       </w:r>
       <w:r>
         <w:rPr>
@@ -2087,34 +2217,52 @@
           <w:sz w:val="20"/>
           <w:szCs w:val="20"/>
         </w:rPr>
-        <w:t xml:space="preserve">--output-format json</w:t>
-      </w:r>
-      <w:r>
-        <w:t xml:space="preserve"> gives machine-parseable output (result, cost, session id) for downstream steps.</w:t>
-      </w:r>
-    </w:p>
-    <w:p>
-      <w:pPr>
-        <w:pStyle w:val="ListParagraph"/>
-        <w:numPr>
-          <w:ilvl w:val="0"/>
-          <w:numId w:val="2"/>
-        </w:numPr>
-        <w:spacing w:after="80"/>
-      </w:pPr>
-      <w:r>
-        <w:t xml:space="preserve">Each headless invocation is a </w:t>
-      </w:r>
-      <w:r>
-        <w:rPr>
-          <w:b/>
-          <w:bCs/>
-        </w:rPr>
-        <w:t xml:space="preserve">fresh, isolated session</w:t>
-      </w:r>
-      <w:r>
-        <w:t xml:space="preserve"> — no memory of previous runs unless you pass </w:t>
-      </w:r>
+        <w:t xml:space="preserve">context: fork</w:t>
+      </w:r>
+      <w:r>
+        <w:t xml:space="preserve"> runs it in a subagent so its work doesn't consume the main context.</w:t>
+      </w:r>
+    </w:p>
+    <w:p>
+      <w:pPr>
+        <w:pStyle w:val="Heading2"/>
+        <w:spacing w:after="120" w:before="280"/>
+      </w:pPr>
+      <w:r>
+        <w:t xml:space="preserve">Plan mode vs. direct execution</w:t>
+      </w:r>
+    </w:p>
+    <w:p>
+      <w:pPr>
+        <w:pStyle w:val="ListParagraph"/>
+        <w:numPr>
+          <w:ilvl w:val="0"/>
+          <w:numId w:val="2"/>
+        </w:numPr>
+        <w:spacing w:after="80"/>
+      </w:pPr>
+      <w:r>
+        <w:t xml:space="preserve">Plan mode makes Claude research and propose an approach before editing anything. Choose it for multi-file refactors, unfamiliar codebases, or risky changes needing review. Direct execution is right for small, well-understood edits — planning everything wastes time and tokens.</w:t>
+      </w:r>
+    </w:p>
+    <w:p>
+      <w:pPr>
+        <w:pStyle w:val="Heading2"/>
+        <w:spacing w:after="120" w:before="280"/>
+      </w:pPr>
+      <w:r>
+        <w:t xml:space="preserve">Headless mode and CI/CD</w:t>
+      </w:r>
+    </w:p>
+    <w:p>
+      <w:pPr>
+        <w:pStyle w:val="ListParagraph"/>
+        <w:numPr>
+          <w:ilvl w:val="0"/>
+          <w:numId w:val="2"/>
+        </w:numPr>
+        <w:spacing w:after="80"/>
+      </w:pPr>
       <w:r>
         <w:rPr>
           <w:rFonts w:ascii="Consolas" w:cs="Consolas" w:eastAsia="Consolas" w:hAnsi="Consolas"/>
@@ -2122,10 +2270,10 @@
           <w:sz w:val="20"/>
           <w:szCs w:val="20"/>
         </w:rPr>
-        <w:t xml:space="preserve">--resume &lt;session-id&gt;</w:t>
-      </w:r>
-      <w:r>
-        <w:t xml:space="preserve"> or </w:t>
+        <w:t xml:space="preserve">claude -p "prompt"</w:t>
+      </w:r>
+      <w:r>
+        <w:t xml:space="preserve"> runs non-interactively (print mode) for pipelines; </w:t>
       </w:r>
       <w:r>
         <w:rPr>
@@ -2134,23 +2282,33 @@
           <w:sz w:val="20"/>
           <w:szCs w:val="20"/>
         </w:rPr>
-        <w:t xml:space="preserve">--continue</w:t>
-      </w:r>
-      <w:r>
-        <w:t xml:space="preserve">. Exam questions probe this: two pipeline steps don't share context by default.</w:t>
-      </w:r>
-    </w:p>
-    <w:p>
-      <w:pPr>
-        <w:pStyle w:val="ListParagraph"/>
-        <w:numPr>
-          <w:ilvl w:val="0"/>
-          <w:numId w:val="2"/>
-        </w:numPr>
-        <w:spacing w:after="80"/>
-      </w:pPr>
-      <w:r>
-        <w:t xml:space="preserve">CI review quality: constrain with explicit review criteria and severity categories to minimize false positives; </w:t>
+        <w:t xml:space="preserve">--output-format json</w:t>
+      </w:r>
+      <w:r>
+        <w:t xml:space="preserve"> gives machine-parseable output (result, cost, session id) for downstream steps.</w:t>
+      </w:r>
+    </w:p>
+    <w:p>
+      <w:pPr>
+        <w:pStyle w:val="ListParagraph"/>
+        <w:numPr>
+          <w:ilvl w:val="0"/>
+          <w:numId w:val="2"/>
+        </w:numPr>
+        <w:spacing w:after="80"/>
+      </w:pPr>
+      <w:r>
+        <w:t xml:space="preserve">Each headless invocation is a </w:t>
+      </w:r>
+      <w:r>
+        <w:rPr>
+          <w:b/>
+          <w:bCs/>
+        </w:rPr>
+        <w:t xml:space="preserve">fresh, isolated session</w:t>
+      </w:r>
+      <w:r>
+        <w:t xml:space="preserve"> — no memory of previous runs unless you pass </w:t>
       </w:r>
       <w:r>
         <w:rPr>
@@ -2159,30 +2317,11 @@
           <w:sz w:val="20"/>
           <w:szCs w:val="20"/>
         </w:rPr>
-        <w:t xml:space="preserve">--allowedTools</w:t>
-      </w:r>
-      <w:r>
-        <w:t xml:space="preserve"> limits what the pipeline run may do; hooks can gate or log tool use.</w:t>
-      </w:r>
-    </w:p>
-    <w:p>
-      <w:pPr>
-        <w:pStyle w:val="Heading2"/>
-        <w:spacing w:after="120" w:before="280"/>
-      </w:pPr>
-      <w:r>
-        <w:t xml:space="preserve">MCP in Claude Code</w:t>
-      </w:r>
-    </w:p>
-    <w:p>
-      <w:pPr>
-        <w:pStyle w:val="ListParagraph"/>
-        <w:numPr>
-          <w:ilvl w:val="0"/>
-          <w:numId w:val="2"/>
-        </w:numPr>
-        <w:spacing w:after="80"/>
-      </w:pPr>
+        <w:t xml:space="preserve">--resume &lt;session-id&gt;</w:t>
+      </w:r>
+      <w:r>
+        <w:t xml:space="preserve"> or </w:t>
+      </w:r>
       <w:r>
         <w:rPr>
           <w:rFonts w:ascii="Consolas" w:cs="Consolas" w:eastAsia="Consolas" w:hAnsi="Consolas"/>
@@ -2190,129 +2329,23 @@
           <w:sz w:val="20"/>
           <w:szCs w:val="20"/>
         </w:rPr>
-        <w:t xml:space="preserve">.mcp.json</w:t>
-      </w:r>
-      <w:r>
-        <w:t xml:space="preserve"> at the project root defines project-scoped MCP servers (shared with the team via version control); user scope makes a server available across your projects; local scope keeps it private to one project. Choose scope by who should get the server.</w:t>
-      </w:r>
-    </w:p>
-    <w:p>
-      <w:pPr>
-        <w:pStyle w:val="Heading1"/>
-        <w:spacing w:after="160" w:before="360"/>
-      </w:pPr>
-      <w:r>
-        <w:rPr>
-          <w:color w:val="C15F3C"/>
-        </w:rPr>
-        <w:t xml:space="preserve">4. Domain 3 — Prompt Engineering &amp; Structured Output (20%)</w:t>
-      </w:r>
-    </w:p>
-    <w:p>
-      <w:pPr>
-        <w:pStyle w:val="Heading2"/>
-        <w:spacing w:after="120" w:before="280"/>
-      </w:pPr>
-      <w:r>
-        <w:t xml:space="preserve">Prompting principles the exam rewards</w:t>
-      </w:r>
-    </w:p>
-    <w:p>
-      <w:pPr>
-        <w:pStyle w:val="ListParagraph"/>
-        <w:numPr>
-          <w:ilvl w:val="0"/>
-          <w:numId w:val="2"/>
-        </w:numPr>
-        <w:spacing w:after="80"/>
-      </w:pPr>
-      <w:r>
-        <w:rPr>
-          <w:b/>
-          <w:bCs/>
-        </w:rPr>
-        <w:t xml:space="preserve">Explicit criteria beat vague instructions.</w:t>
-      </w:r>
-      <w:r>
-        <w:t xml:space="preserve"> 'Flag SQL built by string concatenation with user input' outperforms 'be careful about security'. Wrong answers on the exam are usually the vague ones.</w:t>
-      </w:r>
-    </w:p>
-    <w:p>
-      <w:pPr>
-        <w:pStyle w:val="ListParagraph"/>
-        <w:numPr>
-          <w:ilvl w:val="0"/>
-          <w:numId w:val="2"/>
-        </w:numPr>
-        <w:spacing w:after="80"/>
-      </w:pPr>
-      <w:r>
-        <w:rPr>
-          <w:b/>
-          <w:bCs/>
-        </w:rPr>
-        <w:t xml:space="preserve">Few-shot examples</w:t>
-      </w:r>
-      <w:r>
-        <w:t xml:space="preserve"> are the highest-leverage fix for ambiguous or judgment-call cases (e.g. edge cases in classification) — show 2–3 worked examples including a tricky one.</w:t>
-      </w:r>
-    </w:p>
-    <w:p>
-      <w:pPr>
-        <w:pStyle w:val="ListParagraph"/>
-        <w:numPr>
-          <w:ilvl w:val="0"/>
-          <w:numId w:val="2"/>
-        </w:numPr>
-        <w:spacing w:after="80"/>
-      </w:pPr>
-      <w:r>
-        <w:t xml:space="preserve">Use XML tags to separate instructions, context, and examples; put long documents before the question; give Claude an out ('if the information is not present, say so').</w:t>
-      </w:r>
-    </w:p>
-    <w:p>
-      <w:pPr>
-        <w:pStyle w:val="ListParagraph"/>
-        <w:numPr>
-          <w:ilvl w:val="0"/>
-          <w:numId w:val="2"/>
-        </w:numPr>
-        <w:spacing w:after="80"/>
-      </w:pPr>
-      <w:r>
-        <w:t xml:space="preserve">Chain of thought (think step by step / extended thinking) helps multi-step reasoning; prefilling the assistant turn constrains format in non-tool settings.</w:t>
-      </w:r>
-    </w:p>
-    <w:p>
-      <w:pPr>
-        <w:pStyle w:val="Heading2"/>
-        <w:spacing w:after="120" w:before="280"/>
-      </w:pPr>
-      <w:r>
-        <w:t xml:space="preserve">Guaranteed structured output</w:t>
-      </w:r>
-    </w:p>
-    <w:p>
-      <w:pPr>
-        <w:pStyle w:val="ListParagraph"/>
-        <w:numPr>
-          <w:ilvl w:val="0"/>
-          <w:numId w:val="2"/>
-        </w:numPr>
-        <w:spacing w:after="80"/>
-      </w:pPr>
-      <w:r>
-        <w:t xml:space="preserve">The most reliable way to get schema-conforming JSON is </w:t>
-      </w:r>
-      <w:r>
-        <w:rPr>
-          <w:b/>
-          <w:bCs/>
-        </w:rPr>
-        <w:t xml:space="preserve">tool use</w:t>
-      </w:r>
-      <w:r>
-        <w:t xml:space="preserve">: define a tool whose input schema is your target shape and force it with </w:t>
+        <w:t xml:space="preserve">--continue</w:t>
+      </w:r>
+      <w:r>
+        <w:t xml:space="preserve">. Exam questions probe this: two pipeline steps don't share context by default.</w:t>
+      </w:r>
+    </w:p>
+    <w:p>
+      <w:pPr>
+        <w:pStyle w:val="ListParagraph"/>
+        <w:numPr>
+          <w:ilvl w:val="0"/>
+          <w:numId w:val="2"/>
+        </w:numPr>
+        <w:spacing w:after="80"/>
+      </w:pPr>
+      <w:r>
+        <w:t xml:space="preserve">CI review quality: constrain with explicit review criteria and severity categories to minimize false positives; </w:t>
       </w:r>
       <w:r>
         <w:rPr>
@@ -2321,50 +2354,10 @@
           <w:sz w:val="20"/>
           <w:szCs w:val="20"/>
         </w:rPr>
-        <w:t xml:space="preserve">tool_choice</w:t>
-      </w:r>
-      <w:r>
-        <w:t xml:space="preserve">. The model must emit arguments matching the JSON schema.</w:t>
-      </w:r>
-    </w:p>
-    <w:p>
-      <w:pPr>
-        <w:pStyle w:val="ListParagraph"/>
-        <w:numPr>
-          <w:ilvl w:val="0"/>
-          <w:numId w:val="2"/>
-        </w:numPr>
-        <w:spacing w:after="80"/>
-      </w:pPr>
-      <w:r>
-        <w:rPr>
-          <w:b/>
-          <w:bCs/>
-        </w:rPr>
-        <w:t xml:space="preserve">Nullable fields prevent hallucination.</w:t>
-      </w:r>
-      <w:r>
-        <w:t xml:space="preserve"> If a document may lack a value, make the field nullable/optional. A required field forces the model to invent something — a classic exam trap.</w:t>
-      </w:r>
-    </w:p>
-    <w:p>
-      <w:pPr>
-        <w:pStyle w:val="ListParagraph"/>
-        <w:numPr>
-          <w:ilvl w:val="0"/>
-          <w:numId w:val="2"/>
-        </w:numPr>
-        <w:spacing w:after="80"/>
-      </w:pPr>
-      <w:r>
-        <w:rPr>
-          <w:b/>
-          <w:bCs/>
-        </w:rPr>
-        <w:t xml:space="preserve">Validation-retry loop:</w:t>
-      </w:r>
-      <w:r>
-        <w:t xml:space="preserve"> validate output against the schema (plus business rules); on failure, re-prompt with the specific validation errors attached. Bound the retries and route persistent failures to review — don't retry forever, don't silently accept bad data.</w:t>
+        <w:t xml:space="preserve">--allowedTools</w:t>
+      </w:r>
+      <w:r>
+        <w:t xml:space="preserve"> limits what the pipeline run may do; hooks can gate or log tool use.</w:t>
       </w:r>
     </w:p>
     <w:p>
@@ -2373,152 +2366,18 @@
         <w:spacing w:after="120" w:before="280"/>
       </w:pPr>
       <w:r>
-        <w:t xml:space="preserve">Batch processing</w:t>
-      </w:r>
-    </w:p>
-    <w:p>
-      <w:pPr>
-        <w:pStyle w:val="ListParagraph"/>
-        <w:numPr>
-          <w:ilvl w:val="0"/>
-          <w:numId w:val="2"/>
-        </w:numPr>
-        <w:spacing w:after="80"/>
-      </w:pPr>
-      <w:r>
-        <w:t xml:space="preserve">The </w:t>
-      </w:r>
-      <w:r>
-        <w:rPr>
-          <w:b/>
-          <w:bCs/>
-        </w:rPr>
-        <w:t xml:space="preserve">Message Batches API</w:t>
-      </w:r>
-      <w:r>
-        <w:t xml:space="preserve"> processes large asynchronous workloads (up to ~100k requests per batch, most complete within an hour, 24-hour window) at </w:t>
-      </w:r>
-      <w:r>
-        <w:rPr>
-          <w:b/>
-          <w:bCs/>
-        </w:rPr>
-        <w:t xml:space="preserve">50% of standard token cost</w:t>
-      </w:r>
-      <w:r>
-        <w:t xml:space="preserve">. Right answer whenever the scenario says 'thousands of documents, not latency-sensitive'. Real-time user interactions stay on the standard API.</w:t>
-      </w:r>
-    </w:p>
-    <w:p>
-      <w:pPr>
-        <w:pStyle w:val="Heading2"/>
-        <w:spacing w:after="120" w:before="280"/>
-      </w:pPr>
-      <w:r>
-        <w:t xml:space="preserve">Multi-pass architectures</w:t>
-      </w:r>
-    </w:p>
-    <w:p>
-      <w:pPr>
-        <w:pStyle w:val="ListParagraph"/>
-        <w:numPr>
-          <w:ilvl w:val="0"/>
-          <w:numId w:val="2"/>
-        </w:numPr>
-        <w:spacing w:after="80"/>
-      </w:pPr>
-      <w:r>
-        <w:t xml:space="preserve">For high-accuracy review/extraction: separate passes with narrow criteria (extract → validate → judge) beat one mega-prompt. A second 'reviewer' pass with explicit rubric cuts false positives.</w:t>
-      </w:r>
-    </w:p>
-    <w:p>
-      <w:pPr>
-        <w:pStyle w:val="Heading1"/>
-        <w:spacing w:after="160" w:before="360"/>
-      </w:pPr>
-      <w:r>
-        <w:rPr>
-          <w:color w:val="C15F3C"/>
-        </w:rPr>
-        <w:t xml:space="preserve">5. Domain 4 — Tool Design &amp; MCP Integration (18%)</w:t>
-      </w:r>
-    </w:p>
-    <w:p>
-      <w:pPr>
-        <w:pStyle w:val="Heading2"/>
-        <w:spacing w:after="120" w:before="280"/>
-      </w:pPr>
-      <w:r>
-        <w:t xml:space="preserve">Writing tools Claude can use correctly</w:t>
-      </w:r>
-    </w:p>
-    <w:p>
-      <w:pPr>
-        <w:pStyle w:val="ListParagraph"/>
-        <w:numPr>
-          <w:ilvl w:val="0"/>
-          <w:numId w:val="2"/>
-        </w:numPr>
-        <w:spacing w:after="80"/>
-      </w:pPr>
-      <w:r>
-        <w:rPr>
-          <w:b/>
-          <w:bCs/>
-        </w:rPr>
-        <w:t xml:space="preserve">Descriptions are prompts.</w:t>
-      </w:r>
-      <w:r>
-        <w:t xml:space="preserve"> Say what the tool does, when to use it, and when NOT to — especially for similar-sounding tools. Most tool-selection bugs are description bugs, not model bugs.</w:t>
-      </w:r>
-    </w:p>
-    <w:p>
-      <w:pPr>
-        <w:pStyle w:val="ListParagraph"/>
-        <w:numPr>
-          <w:ilvl w:val="0"/>
-          <w:numId w:val="2"/>
-        </w:numPr>
-        <w:spacing w:after="80"/>
-      </w:pPr>
-      <w:r>
-        <w:t xml:space="preserve">Avoid overlapping tools; merge or sharply differentiate them. Fewer, well-named, well-scoped tools beat many ambiguous ones. Distribute tools across agents so each agent sees only what its role needs.</w:t>
-      </w:r>
-    </w:p>
-    <w:p>
-      <w:pPr>
-        <w:pStyle w:val="ListParagraph"/>
-        <w:numPr>
-          <w:ilvl w:val="0"/>
-          <w:numId w:val="2"/>
-        </w:numPr>
-        <w:spacing w:after="80"/>
-      </w:pPr>
-      <w:r>
-        <w:t xml:space="preserve">Input schemas: descriptive parameter names, enums for closed sets, required vs. optional made deliberate. Return concise, high-signal results — huge payloads burn context.</w:t>
-      </w:r>
-    </w:p>
-    <w:p>
-      <w:pPr>
-        <w:pStyle w:val="Heading2"/>
-        <w:spacing w:after="120" w:before="280"/>
-      </w:pPr>
-      <w:r>
-        <w:t xml:space="preserve">Structured error responses</w:t>
-      </w:r>
-    </w:p>
-    <w:p>
-      <w:pPr>
-        <w:pStyle w:val="ListParagraph"/>
-        <w:numPr>
-          <w:ilvl w:val="0"/>
-          <w:numId w:val="2"/>
-        </w:numPr>
-        <w:spacing w:after="80"/>
-      </w:pPr>
-      <w:r>
-        <w:t xml:space="preserve">Return errors to the model as data it can act on: an </w:t>
-      </w:r>
+        <w:t xml:space="preserve">MCP in Claude Code</w:t>
+      </w:r>
+    </w:p>
+    <w:p>
+      <w:pPr>
+        <w:pStyle w:val="ListParagraph"/>
+        <w:numPr>
+          <w:ilvl w:val="0"/>
+          <w:numId w:val="2"/>
+        </w:numPr>
+        <w:spacing w:after="80"/>
+      </w:pPr>
       <w:r>
         <w:rPr>
           <w:rFonts w:ascii="Consolas" w:cs="Consolas" w:eastAsia="Consolas" w:hAnsi="Consolas"/>
@@ -2526,10 +2385,129 @@
           <w:sz w:val="20"/>
           <w:szCs w:val="20"/>
         </w:rPr>
-        <w:t xml:space="preserve">errorCategory</w:t>
-      </w:r>
-      <w:r>
-        <w:t xml:space="preserve"> (e.g. validation, not_found, rate_limit), an </w:t>
+        <w:t xml:space="preserve">.mcp.json</w:t>
+      </w:r>
+      <w:r>
+        <w:t xml:space="preserve"> at the project root defines project-scoped MCP servers (shared with the team via version control); user scope makes a server available across your projects; local scope keeps it private to one project. Choose scope by who should get the server.</w:t>
+      </w:r>
+    </w:p>
+    <w:p>
+      <w:pPr>
+        <w:pStyle w:val="Heading1"/>
+        <w:spacing w:after="160" w:before="360"/>
+      </w:pPr>
+      <w:r>
+        <w:rPr>
+          <w:color w:val="C15F3C"/>
+        </w:rPr>
+        <w:t xml:space="preserve">5. Domain 4 — Prompt Engineering &amp; Structured Output (20%)</w:t>
+      </w:r>
+    </w:p>
+    <w:p>
+      <w:pPr>
+        <w:pStyle w:val="Heading2"/>
+        <w:spacing w:after="120" w:before="280"/>
+      </w:pPr>
+      <w:r>
+        <w:t xml:space="preserve">Prompting principles the exam rewards</w:t>
+      </w:r>
+    </w:p>
+    <w:p>
+      <w:pPr>
+        <w:pStyle w:val="ListParagraph"/>
+        <w:numPr>
+          <w:ilvl w:val="0"/>
+          <w:numId w:val="2"/>
+        </w:numPr>
+        <w:spacing w:after="80"/>
+      </w:pPr>
+      <w:r>
+        <w:rPr>
+          <w:b/>
+          <w:bCs/>
+        </w:rPr>
+        <w:t xml:space="preserve">Explicit criteria beat vague instructions.</w:t>
+      </w:r>
+      <w:r>
+        <w:t xml:space="preserve"> 'Flag SQL built by string concatenation with user input' outperforms 'be careful about security'. Wrong answers on the exam are usually the vague ones.</w:t>
+      </w:r>
+    </w:p>
+    <w:p>
+      <w:pPr>
+        <w:pStyle w:val="ListParagraph"/>
+        <w:numPr>
+          <w:ilvl w:val="0"/>
+          <w:numId w:val="2"/>
+        </w:numPr>
+        <w:spacing w:after="80"/>
+      </w:pPr>
+      <w:r>
+        <w:rPr>
+          <w:b/>
+          <w:bCs/>
+        </w:rPr>
+        <w:t xml:space="preserve">Few-shot examples</w:t>
+      </w:r>
+      <w:r>
+        <w:t xml:space="preserve"> are the highest-leverage fix for ambiguous or judgment-call cases (e.g. edge cases in classification) — show 2–3 worked examples including a tricky one.</w:t>
+      </w:r>
+    </w:p>
+    <w:p>
+      <w:pPr>
+        <w:pStyle w:val="ListParagraph"/>
+        <w:numPr>
+          <w:ilvl w:val="0"/>
+          <w:numId w:val="2"/>
+        </w:numPr>
+        <w:spacing w:after="80"/>
+      </w:pPr>
+      <w:r>
+        <w:t xml:space="preserve">Use XML tags to separate instructions, context, and examples; put long documents before the question; give Claude an out ('if the information is not present, say so').</w:t>
+      </w:r>
+    </w:p>
+    <w:p>
+      <w:pPr>
+        <w:pStyle w:val="ListParagraph"/>
+        <w:numPr>
+          <w:ilvl w:val="0"/>
+          <w:numId w:val="2"/>
+        </w:numPr>
+        <w:spacing w:after="80"/>
+      </w:pPr>
+      <w:r>
+        <w:t xml:space="preserve">Chain of thought (think step by step / extended thinking) helps multi-step reasoning; prefilling the assistant turn constrains format in non-tool settings.</w:t>
+      </w:r>
+    </w:p>
+    <w:p>
+      <w:pPr>
+        <w:pStyle w:val="Heading2"/>
+        <w:spacing w:after="120" w:before="280"/>
+      </w:pPr>
+      <w:r>
+        <w:t xml:space="preserve">Guaranteed structured output</w:t>
+      </w:r>
+    </w:p>
+    <w:p>
+      <w:pPr>
+        <w:pStyle w:val="ListParagraph"/>
+        <w:numPr>
+          <w:ilvl w:val="0"/>
+          <w:numId w:val="2"/>
+        </w:numPr>
+        <w:spacing w:after="80"/>
+      </w:pPr>
+      <w:r>
+        <w:t xml:space="preserve">The most reliable way to get schema-conforming JSON is </w:t>
+      </w:r>
+      <w:r>
+        <w:rPr>
+          <w:b/>
+          <w:bCs/>
+        </w:rPr>
+        <w:t xml:space="preserve">tool use</w:t>
+      </w:r>
+      <w:r>
+        <w:t xml:space="preserve">: define a tool whose input schema is your target shape and force it with </w:t>
       </w:r>
       <w:r>
         <w:rPr>
@@ -2538,10 +2516,50 @@
           <w:sz w:val="20"/>
           <w:szCs w:val="20"/>
         </w:rPr>
-        <w:t xml:space="preserve">isRetryable</w:t>
-      </w:r>
-      <w:r>
-        <w:t xml:space="preserve"> flag, and a human-readable message suggesting the fix. This lets the agent decide: retry, change inputs, try another tool, or escalate. Raising an unstructured exception (or hiding the failure) strands the loop.</w:t>
+        <w:t xml:space="preserve">tool_choice</w:t>
+      </w:r>
+      <w:r>
+        <w:t xml:space="preserve">. The model must emit arguments matching the JSON schema.</w:t>
+      </w:r>
+    </w:p>
+    <w:p>
+      <w:pPr>
+        <w:pStyle w:val="ListParagraph"/>
+        <w:numPr>
+          <w:ilvl w:val="0"/>
+          <w:numId w:val="2"/>
+        </w:numPr>
+        <w:spacing w:after="80"/>
+      </w:pPr>
+      <w:r>
+        <w:rPr>
+          <w:b/>
+          <w:bCs/>
+        </w:rPr>
+        <w:t xml:space="preserve">Nullable fields prevent hallucination.</w:t>
+      </w:r>
+      <w:r>
+        <w:t xml:space="preserve"> If a document may lack a value, make the field nullable/optional. A required field forces the model to invent something — a classic exam trap.</w:t>
+      </w:r>
+    </w:p>
+    <w:p>
+      <w:pPr>
+        <w:pStyle w:val="ListParagraph"/>
+        <w:numPr>
+          <w:ilvl w:val="0"/>
+          <w:numId w:val="2"/>
+        </w:numPr>
+        <w:spacing w:after="80"/>
+      </w:pPr>
+      <w:r>
+        <w:rPr>
+          <w:b/>
+          <w:bCs/>
+        </w:rPr>
+        <w:t xml:space="preserve">Validation-retry loop:</w:t>
+      </w:r>
+      <w:r>
+        <w:t xml:space="preserve"> validate output against the schema (plus business rules); on failure, re-prompt with the specific validation errors attached. Bound the retries and route persistent failures to review — don't retry forever, don't silently accept bad data.</w:t>
       </w:r>
     </w:p>
     <w:p>
@@ -2550,80 +2568,62 @@
         <w:spacing w:after="120" w:before="280"/>
       </w:pPr>
       <w:r>
-        <w:t xml:space="preserve">MCP essentials</w:t>
-      </w:r>
-    </w:p>
-    <w:p>
-      <w:pPr>
-        <w:pStyle w:val="ListParagraph"/>
-        <w:numPr>
-          <w:ilvl w:val="0"/>
-          <w:numId w:val="2"/>
-        </w:numPr>
-        <w:spacing w:after="80"/>
-      </w:pPr>
-      <w:r>
-        <w:rPr>
-          <w:b/>
-          <w:bCs/>
-        </w:rPr>
-        <w:t xml:space="preserve">Primitives: tools</w:t>
-      </w:r>
-      <w:r>
-        <w:t xml:space="preserve"> (model-invoked actions), </w:t>
-      </w:r>
-      <w:r>
-        <w:rPr>
-          <w:b/>
-          <w:bCs/>
-        </w:rPr>
-        <w:t xml:space="preserve">resources</w:t>
-      </w:r>
-      <w:r>
-        <w:t xml:space="preserve"> (application-controlled data/context), </w:t>
-      </w:r>
-      <w:r>
-        <w:rPr>
-          <w:b/>
-          <w:bCs/>
-        </w:rPr>
-        <w:t xml:space="preserve">prompts</w:t>
-      </w:r>
-      <w:r>
-        <w:t xml:space="preserve"> (user-invoked templates). Know which is which — 'expose read-only reference data' → resource, 'let the model act' → tool.</w:t>
-      </w:r>
-    </w:p>
-    <w:p>
-      <w:pPr>
-        <w:pStyle w:val="ListParagraph"/>
-        <w:numPr>
-          <w:ilvl w:val="0"/>
-          <w:numId w:val="2"/>
-        </w:numPr>
-        <w:spacing w:after="80"/>
-      </w:pPr>
-      <w:r>
-        <w:rPr>
-          <w:b/>
-          <w:bCs/>
-        </w:rPr>
-        <w:t xml:space="preserve">Transports:</w:t>
-      </w:r>
-      <w:r>
-        <w:t xml:space="preserve"> stdio for local/same-machine servers; streamable HTTP for remote/shared servers. Remote servers typically add OAuth-based auth.</w:t>
-      </w:r>
-    </w:p>
-    <w:p>
-      <w:pPr>
-        <w:pStyle w:val="ListParagraph"/>
-        <w:numPr>
-          <w:ilvl w:val="0"/>
-          <w:numId w:val="2"/>
-        </w:numPr>
-        <w:spacing w:after="80"/>
-      </w:pPr>
-      <w:r>
-        <w:t xml:space="preserve">Advanced topics that appear: sampling (server asks the client's model for a completion), notifications (server-initiated updates), and keeping servers stateless for scale.</w:t>
+        <w:t xml:space="preserve">Batch processing</w:t>
+      </w:r>
+    </w:p>
+    <w:p>
+      <w:pPr>
+        <w:pStyle w:val="ListParagraph"/>
+        <w:numPr>
+          <w:ilvl w:val="0"/>
+          <w:numId w:val="2"/>
+        </w:numPr>
+        <w:spacing w:after="80"/>
+      </w:pPr>
+      <w:r>
+        <w:t xml:space="preserve">The </w:t>
+      </w:r>
+      <w:r>
+        <w:rPr>
+          <w:b/>
+          <w:bCs/>
+        </w:rPr>
+        <w:t xml:space="preserve">Message Batches API</w:t>
+      </w:r>
+      <w:r>
+        <w:t xml:space="preserve"> processes large asynchronous workloads (up to ~100k requests per batch, most complete within an hour, 24-hour window) at </w:t>
+      </w:r>
+      <w:r>
+        <w:rPr>
+          <w:b/>
+          <w:bCs/>
+        </w:rPr>
+        <w:t xml:space="preserve">50% of standard token cost</w:t>
+      </w:r>
+      <w:r>
+        <w:t xml:space="preserve">. Right answer whenever the scenario says 'thousands of documents, not latency-sensitive'. Real-time user interactions stay on the standard API.</w:t>
+      </w:r>
+    </w:p>
+    <w:p>
+      <w:pPr>
+        <w:pStyle w:val="Heading2"/>
+        <w:spacing w:after="120" w:before="280"/>
+      </w:pPr>
+      <w:r>
+        <w:t xml:space="preserve">Multi-pass architectures</w:t>
+      </w:r>
+    </w:p>
+    <w:p>
+      <w:pPr>
+        <w:pStyle w:val="ListParagraph"/>
+        <w:numPr>
+          <w:ilvl w:val="0"/>
+          <w:numId w:val="2"/>
+        </w:numPr>
+        <w:spacing w:after="80"/>
+      </w:pPr>
+      <w:r>
+        <w:t xml:space="preserve">For high-accuracy review/extraction: separate passes with narrow criteria (extract → validate → judge) beat one mega-prompt. A second 'reviewer' pass with explicit rubric cuts false positives.</w:t>
       </w:r>
     </w:p>
     <w:p>
@@ -2952,7 +2952,7 @@
                 <w:sz w:val="20"/>
                 <w:szCs w:val="20"/>
               </w:rPr>
-              <w:t xml:space="preserve">Domains 3, 4 — tool use, structured output</w:t>
+              <w:t xml:space="preserve">Domains 2, 4 — tool use, structured output</w:t>
             </w:r>
           </w:p>
         </w:tc>
@@ -3023,7 +3023,7 @@
                 <w:sz w:val="20"/>
                 <w:szCs w:val="20"/>
               </w:rPr>
-              <w:t xml:space="preserve">Domain 4</w:t>
+              <w:t xml:space="preserve">Domain 2</w:t>
             </w:r>
           </w:p>
         </w:tc>
@@ -3091,7 +3091,7 @@
                 <w:sz w:val="20"/>
                 <w:szCs w:val="20"/>
               </w:rPr>
-              <w:t xml:space="preserve">Domain 2</w:t>
+              <w:t xml:space="preserve">Domain 3</w:t>
             </w:r>
           </w:p>
         </w:tc>
@@ -3162,7 +3162,7 @@
                 <w:sz w:val="20"/>
                 <w:szCs w:val="20"/>
               </w:rPr>
-              <w:t xml:space="preserve">Domains 1, 2</w:t>
+              <w:t xml:space="preserve">Domains 1, 3</w:t>
             </w:r>
           </w:p>
         </w:tc>

</xml_diff>

<commit_message>
Fix draw apportionment; rewrite CLAUDE.md against actual code; refresh exam logistics
weightedDraw: replace round-then-subtract-from-D1 with largest-remainder
apportionment. The old method always took the rounding surplus out of the
heaviest domain, drawing D1 at 24% against a 27% target in a 25-question
exam. Also backfills if a domain cannot supply its allocation.

CLAUDE.md: previous version documented five functions that do not exist
(selectAnswer, submitAttempt, renderApp, calculateScore, getReviewItems),
the wrong localStorage key, multiple-response via 'a' as an array rather
than the separate 'm' key, a fixed /70 scoring divisor, and the superseded
weight-ordered domain numbering. Rewritten and verified against index.html.

Exam logistics (re-checked against Anthropic's certification FAQ 2026-09-24):
- reschedule/cancel window is now 48 hours, not 24
- OnVUE regional restrictions added; Iran suspended since 2026-09-08
- Global Premier 100% discount extended to 2026-12-31
</commit_message>
<xml_diff>
--- a/docs/CCA-F_Study_Guide.docx
+++ b/docs/CCA-F_Study_Guide.docx
@@ -667,6 +667,100 @@
                 <w:szCs w:val="20"/>
               </w:rPr>
               <w:t xml:space="preserve">6+ months hands-on with the Claude API, Agent SDK, Claude Code, and MCP</w:t>
+            </w:r>
+          </w:p>
+        </w:tc>
+      </w:tr>
+      <w:tr>
+        <w:tc>
+          <w:tcPr>
+            <w:tcW w:type="dxa" w:w="2100"/>
+            <w:tcMar>
+              <w:top w:type="dxa" w:w="60"/>
+              <w:left w:type="dxa" w:w="100"/>
+              <w:bottom w:type="dxa" w:w="60"/>
+              <w:right w:type="dxa" w:w="100"/>
+            </w:tcMar>
+          </w:tcPr>
+          <w:p>
+            <w:r>
+              <w:rPr>
+                <w:b w:val="false"/>
+                <w:bCs w:val="false"/>
+                <w:sz w:val="20"/>
+                <w:szCs w:val="20"/>
+              </w:rPr>
+              <w:t xml:space="preserve">Reschedule / cancel</w:t>
+            </w:r>
+          </w:p>
+        </w:tc>
+        <w:tc>
+          <w:tcPr>
+            <w:tcW w:type="dxa" w:w="7260"/>
+            <w:tcMar>
+              <w:top w:type="dxa" w:w="60"/>
+              <w:left w:type="dxa" w:w="100"/>
+              <w:bottom w:type="dxa" w:w="60"/>
+              <w:right w:type="dxa" w:w="100"/>
+            </w:tcMar>
+          </w:tcPr>
+          <w:p>
+            <w:r>
+              <w:rPr>
+                <w:b w:val="false"/>
+                <w:bCs w:val="false"/>
+                <w:sz w:val="20"/>
+                <w:szCs w:val="20"/>
+              </w:rPr>
+              <w:t xml:space="preserve">At least 48 hours before your appointment. Inside 48 hours, or a no-show, forfeits the fee. Cancelling in Pearson does NOT trigger a refund — email certifications-support@anthropic.com</w:t>
+            </w:r>
+          </w:p>
+        </w:tc>
+      </w:tr>
+      <w:tr>
+        <w:tc>
+          <w:tcPr>
+            <w:tcW w:type="dxa" w:w="2100"/>
+            <w:shd w:fill="F5EDE8" w:val="clear"/>
+            <w:tcMar>
+              <w:top w:type="dxa" w:w="60"/>
+              <w:left w:type="dxa" w:w="100"/>
+              <w:bottom w:type="dxa" w:w="60"/>
+              <w:right w:type="dxa" w:w="100"/>
+            </w:tcMar>
+          </w:tcPr>
+          <w:p>
+            <w:r>
+              <w:rPr>
+                <w:b w:val="false"/>
+                <w:bCs w:val="false"/>
+                <w:sz w:val="20"/>
+                <w:szCs w:val="20"/>
+              </w:rPr>
+              <w:t xml:space="preserve">Regional limits</w:t>
+            </w:r>
+          </w:p>
+        </w:tc>
+        <w:tc>
+          <w:tcPr>
+            <w:tcW w:type="dxa" w:w="7260"/>
+            <w:shd w:fill="F5EDE8" w:val="clear"/>
+            <w:tcMar>
+              <w:top w:type="dxa" w:w="60"/>
+              <w:left w:type="dxa" w:w="100"/>
+              <w:bottom w:type="dxa" w:w="60"/>
+              <w:right w:type="dxa" w:w="100"/>
+            </w:tcMar>
+          </w:tcPr>
+          <w:p>
+            <w:r>
+              <w:rPr>
+                <w:b w:val="false"/>
+                <w:bCs w:val="false"/>
+                <w:sz w:val="20"/>
+                <w:szCs w:val="20"/>
+              </w:rPr>
+              <w:t xml:space="preserve">OnVUE online proctoring unavailable for IDs from Belarus, Cuba, North Korea, Russia, Syria and restricted Ukraine regions (test centre instead). Iran suspended entirely since Sept 8, 2026</w:t>
             </w:r>
           </w:p>
         </w:tc>

</xml_diff>